<commit_message>
Part 3 Body 2: teenager-relevant real-world case (BookTok / NPD 2021) replaces the ALS Ice Bucket case
</commit_message>
<xml_diff>
--- a/2026_2027_Unit_6_Part_B_Lesson_Notes_teacher_final.docx
+++ b/2026_2027_Unit_6_Part_B_Lesson_Notes_teacher_final.docx
@@ -2113,7 +2113,7 @@
               <w:rPr>
                 <w:color w:val="0070C0"/>
               </w:rPr>
-              <w:t xml:space="preserve">The benefits are not hypothetical: a platform built for sharing can mobilise real help.</w:t>
+              <w:t xml:space="preserve">Moreover, the benefits reach beyond friendship: the same platforms have made reading and learning social again.</w:t>
             </w:r>
           </w:p>
           <w:p>
@@ -2130,7 +2130,7 @@
               <w:rPr>
                 <w:color w:val="0070C0"/>
               </w:rPr>
-              <w:t xml:space="preserve">Real-world case — The 2014 Ice Bucket Challenge spread entirely through social media, drew 17 million participants and raised over US$115 million for research into ALS in a single summer.</w:t>
+              <w:t xml:space="preserve">Real-world case — In 2021, US print book sales reached a record 825.7 million copies, and the industry tracker NPD credited TikTok’s #BookTok community — teenagers recommending books to one another in short videos — with helping young adult fiction to its best year on record.</w:t>
             </w:r>
           </w:p>
         </w:tc>

</xml_diff>